<commit_message>
Deploying to gh-pages from @ Morrison-Lab/psc@8fd193f6150c9b800d6fbbe00349b813286b2239 🚀
</commit_message>
<xml_diff>
--- a/chapters/code-repositories.docx
+++ b/chapters/code-repositories.docx
@@ -15,7 +15,7 @@
         <w:pStyle w:val="Date"/>
       </w:pPr>
       <w:r>
-        <w:t xml:space="preserve">Last modified: 2026-10-14 03:08:22 (PDT)</w:t>
+        <w:t xml:space="preserve">Last modified: 2026-10-14 03:38:56 (PDT)</w:t>
       </w:r>
     </w:p>
     <w:p>
@@ -67,13 +67,16 @@
         <w:t xml:space="preserve"> </w:t>
       </w:r>
       <w:r>
-        <w:t xml:space="preserve">begin from the lab’s template repository</w:t>
-      </w:r>
-      <w:r>
-        <w:t xml:space="preserve"> </w:t>
-      </w:r>
-      <w:r>
-        <w:t xml:space="preserve">(</w:t>
+        <w:t xml:space="preserve">begin from a template repository,</w:t>
+      </w:r>
+      <w:r>
+        <w:t xml:space="preserve"> </w:t>
+      </w:r>
+      <w:r>
+        <w:t xml:space="preserve">such as</w:t>
+      </w:r>
+      <w:r>
+        <w:t xml:space="preserve"> </w:t>
       </w:r>
       <w:hyperlink r:id="rId10">
         <w:r>
@@ -84,7 +87,7 @@
         </w:r>
       </w:hyperlink>
       <w:r>
-        <w:t xml:space="preserve">)</w:t>
+        <w:t xml:space="preserve">,</w:t>
       </w:r>
       <w:r>
         <w:t xml:space="preserve"> </w:t>
@@ -118,7 +121,7 @@
         <w:t xml:space="preserve"> </w:t>
       </w:r>
       <w:r>
-        <w:t xml:space="preserve">includes our standard structure, CI workflows, and documentation scaffolding.</w:t>
+        <w:t xml:space="preserve">includes a standard structure, CI workflows, and documentation scaffolding.</w:t>
       </w:r>
       <w:r>
         <w:t xml:space="preserve"> </w:t>
@@ -326,7 +329,7 @@
         <w:pStyle w:val="FirstParagraph"/>
       </w:pPr>
       <w:r>
-        <w:t xml:space="preserve">In short: if the lab ever mirrors this workflow onto a self-managed GitLab CE</w:t>
+        <w:t xml:space="preserve">In short: if you mirror this workflow onto a self-managed GitLab CE</w:t>
       </w:r>
       <w:r>
         <w:t xml:space="preserve"> </w:t>
@@ -355,10 +358,10 @@
           <w:b/>
           <w:bCs/>
         </w:rPr>
-        <w:t xml:space="preserve">All R projects in our lab should be structured as R packages</w:t>
-      </w:r>
-      <w:r>
-        <w:t xml:space="preserve">, even if they are primarily analysis projects and not intended for distribution on CRAN or Bioconductor. This standardized structure provides numerous benefits:</w:t>
+        <w:t xml:space="preserve">We recommend structuring every R project as an R package</w:t>
+      </w:r>
+      <w:r>
+        <w:t xml:space="preserve">, even one that is primarily an analysis project and not intended for distribution on CRAN or Bioconductor. This standardized structure provides numerous benefits:</w:t>
       </w:r>
     </w:p>
     <w:bookmarkStart w:id="14" w:name="why-use-r-package-structure"/>

</xml_diff>

<commit_message>
Deploying to gh-pages from @ Morrison-Lab/psc@17bb0fab18355580a32ac177222fa99412f1a12d 🚀
</commit_message>
<xml_diff>
--- a/chapters/code-repositories.docx
+++ b/chapters/code-repositories.docx
@@ -15,7 +15,7 @@
         <w:pStyle w:val="Date"/>
       </w:pPr>
       <w:r>
-        <w:t xml:space="preserve">Last modified: 2026-10-14 03:38:56 (PDT)</w:t>
+        <w:t xml:space="preserve">Last modified: 2026-10-14 04:06:05 (PDT)</w:t>
       </w:r>
     </w:p>
     <w:p>
@@ -1589,6 +1589,21 @@
           <w:rStyle w:val="VerbatimChar"/>
         </w:rPr>
         <w:t xml:space="preserve">.qmd</w:t>
+      </w:r>
+      <w:r>
+        <w:t xml:space="preserve"> </w:t>
+      </w:r>
+      <w:r>
+        <w:t xml:space="preserve">or</w:t>
+      </w:r>
+      <w:r>
+        <w:t xml:space="preserve"> </w:t>
+      </w:r>
+      <w:r>
+        <w:rPr>
+          <w:rStyle w:val="VerbatimChar"/>
+        </w:rPr>
+        <w:t xml:space="preserve">.Rmd</w:t>
       </w:r>
       <w:r>
         <w:t xml:space="preserve"> </w:t>

</xml_diff>